<commit_message>
Make The Money You Gave Him stories labelled composites; drop Sources page
The quoted women could not be traced to published sources, so they are
now clearly labelled composite examples with illustrative names, and all
claims that the stories were published or on the record are removed.

Co-Authored-By: Claude Opus 5.5 <noreply@anthropic.com>
Claude-Session: https://claude.ai/code/session_01FTqXXezPcjxTATMqkK2PUA
</commit_message>
<xml_diff>
--- a/output/money-you-gave-him/The_Money_You_Gave_Him.docx
+++ b/output/money-you-gave-him/The_Money_You_Gave_Him.docx
@@ -2156,38 +2156,6 @@
           <w:instrText xml:space="preserve"> PAGEREF _Toc240886220 \h </w:instrText>
           <w:fldChar w:fldCharType="separate"/>
           <w:t>34</w:t>
-          <w:fldChar w:fldCharType="end"/>
-        </w:r>
-      </w:hyperlink>
-    </w:p>
-    <w:p>
-      <w:pPr>
-        <w:pStyle w:val="TOC1"/>
-        <w:tabs>
-          <w:tab w:val="right" w:leader="dot" w:pos="9350"/>
-        </w:tabs>
-        <w:rPr>
-          <w:noProof/>
-        </w:rPr>
-      </w:pPr>
-      <w:hyperlink w:anchor="_TocSources" w:history="1">
-        <w:r>
-          <w:rPr>
-            <w:rStyle w:val="Hyperlink"/>
-            <w:noProof/>
-          </w:rPr>
-          <w:t>Sources</w:t>
-        </w:r>
-        <w:r>
-          <w:rPr>
-            <w:noProof/>
-            <w:webHidden/>
-          </w:rPr>
-          <w:tab/>
-          <w:fldChar w:fldCharType="begin"/>
-          <w:instrText xml:space="preserve"> PAGEREF _TocSources \h </w:instrText>
-          <w:fldChar w:fldCharType="separate"/>
-          <w:t>36</w:t>
           <w:fldChar w:fldCharType="end"/>
         </w:r>
       </w:hyperlink>
@@ -2285,7 +2253,7 @@
                 <w:color w:val="1E3A8A"/>
                 <w:sz w:val="21"/>
               </w:rPr>
-              <w:t>This is not financial advice, legal advice, or therapy. It is a practical guide to a specific situation, built from published interviews with Nigerian women and from public regulation. Where money or law is involved, it tells you what to ask and who to ask. It does not tell you what to do with your savings, and it does not diagnose anybody.</w:t>
+              <w:t>This is not financial advice, legal advice, or therapy. It is a practical guide to a specific situation, built from experiences Nigerian women commonly describe and from public regulation. Where money or law is involved, it tells you what to ask and who to ask. It does not tell you what to do with your savings, and it does not diagnose anybody.</w:t>
             </w:r>
           </w:p>
         </w:tc>
@@ -2338,7 +2306,7 @@
                 <w:color w:val="1E3A8A"/>
                 <w:sz w:val="21"/>
               </w:rPr>
-              <w:t>Every woman quoted here is real and gave her account to a Nigerian publication. Where a name is given, it appears as published, along with her age. Nothing has been invented, and no story has been dressed up. The publications are listed under Sources at the back. Their words are doing the work that a made-up case study cannot.</w:t>
+              <w:t>The women in this book are composite examples, drawn from experiences Nigerian women commonly describe. Their names, ages and details are illustrative, not real people. What happens to them is what happens to a lot of women, and that is why their stories are here.</w:t>
             </w:r>
           </w:p>
         </w:tc>
@@ -2410,21 +2378,21 @@
         <w:spacing w:after="160"/>
       </w:pPr>
       <w:r>
-        <w:t>Nigerian women are funding Nigerian men, quietly, at a scale that only shows up when somebody agrees to be interviewed about it.</w:t>
-      </w:r>
-    </w:p>
-    <w:p>
-      <w:pPr>
-        <w:spacing w:after="160"/>
-      </w:pPr>
-      <w:r>
-        <w:t xml:space="preserve">Asiya was twenty, running an online business. She gave ₦500,000 and never saw it again. Her business failed while it was happening. Looking back, she said: </w:t>
+        <w:t>Nigerian women are funding Nigerian men, quietly, at a scale that only shows up when somebody finally talks about it.</w:t>
+      </w:r>
+    </w:p>
+    <w:p>
+      <w:pPr>
+        <w:spacing w:after="160"/>
+      </w:pPr>
+      <w:r>
+        <w:t xml:space="preserve">Tolu was twenty, running an online business. She gave ₦500,000 and never saw it again. Her business failed while it was happening. Looking back, she said: </w:t>
       </w:r>
       <w:r>
         <w:rPr>
           <w:i/>
         </w:rPr>
-        <w:t>"I wonder if he used charm on me because how was I so foolish?"</w:t>
+        <w:t>"How did I not see it? How was I that foolish?"</w:t>
       </w:r>
     </w:p>
     <w:p>
@@ -2433,7 +2401,7 @@
       </w:pPr>
       <w:r>
         <w:lastRenderedPageBreak/>
-        <w:t xml:space="preserve">Another woman, twenty-three, was a machine learning engineer earning about nine hundred dollars a month. Over roughly two years she gave ₦600,000. Her explanation is the most honest sentence in this entire book: </w:t>
+        <w:t xml:space="preserve">Ifeoma was twenty-three, a machine learning engineer earning about nine hundred dollars a month. Over roughly two years she gave ₦600,000. Her explanation is the most honest sentence in this entire book: </w:t>
       </w:r>
       <w:r>
         <w:rPr>
@@ -2447,7 +2415,7 @@
         <w:spacing w:after="160"/>
       </w:pPr>
       <w:r>
-        <w:t xml:space="preserve">Peace was twenty, a student on a ₦20,000 weekly allowance. She gave ₦70,000 over eight months. What happened when she couldn't pay is the thing you'll recognise: </w:t>
+        <w:t xml:space="preserve">Amaka was twenty, a student on a ₦20,000 weekly allowance. She gave ₦70,000 over eight months. What happened when she couldn't pay is the thing you'll recognise: </w:t>
       </w:r>
       <w:r>
         <w:rPr>
@@ -2461,7 +2429,7 @@
         <w:spacing w:after="160"/>
       </w:pPr>
       <w:r>
-        <w:t xml:space="preserve">Charity was thirty-three and earned ₦85,000 a month as a kitchen steward. </w:t>
+        <w:t xml:space="preserve">Bisi was thirty-three and earned ₦85,000 a month as a kitchen steward. </w:t>
       </w:r>
       <w:r>
         <w:rPr>
@@ -2755,15 +2723,15 @@
         <w:spacing w:after="160"/>
       </w:pPr>
       <w:r>
-        <w:t>Nigerian reporting on this documents the same opening move again and again. Requests that start around ₦3,000. Then ₦8,000. Then the number stops being the point.</w:t>
-      </w:r>
-    </w:p>
-    <w:p>
-      <w:pPr>
-        <w:spacing w:after="160"/>
-      </w:pPr>
-      <w:r>
-        <w:t>Kikelomo was twenty. Her account is just amounts: ₦5,000, ₦2,000, ₦5,000 again. No single transfer was worth arguing about. That's how it accumulated.</w:t>
+        <w:t>Woman after woman describes the same opening move. Requests that start around ₦3,000. Then ₦8,000. Then the number stops being the point.</w:t>
+      </w:r>
+    </w:p>
+    <w:p>
+      <w:pPr>
+        <w:spacing w:after="160"/>
+      </w:pPr>
+      <w:r>
+        <w:t>Zainab was twenty. Her story is just amounts: ₦5,000, ₦2,000, ₦5,000 again. No single transfer was worth arguing about. That's how it accumulated.</w:t>
       </w:r>
     </w:p>
     <w:p>
@@ -2888,7 +2856,7 @@
         <w:spacing w:after="160"/>
       </w:pPr>
       <w:r>
-        <w:t>The published accounts tend to move through the same four stages. Not all of them reach stage four. The ones that do took between eight months and several years to get there.</w:t>
+        <w:t>These stories tend to move through the same four stages. Not all of them reach stage four. The ones that do usually take many months, sometimes years, to get there.</w:t>
       </w:r>
     </w:p>
     <w:p>
@@ -2954,7 +2922,7 @@
         <w:t>Stage four: the arrangement.</w:t>
       </w:r>
       <w:r>
-        <w:t xml:space="preserve"> Your money is part of how he lives. He may have stopped earning, or stopped trying, or started something you're funding. Charity's partner had her card. The machine learning engineer from the Introduction described a plan where whoever made it first would lift the other. Then, in her words: </w:t>
+        <w:t xml:space="preserve"> Your money is part of how he lives. He may have stopped earning, or stopped trying, or started something you're funding. Bisi's partner had her card. Ifeoma, the engineer from the Introduction, had a plan where whoever made it first would lift the other. Then, in her words: </w:t>
       </w:r>
       <w:r>
         <w:rPr>
@@ -3135,7 +3103,7 @@
         <w:spacing w:after="160"/>
       </w:pPr>
       <w:r>
-        <w:t xml:space="preserve">The escalation isn't your weakness showing up. It's a sequence, it has stages, and it runs roughly the same way whether you earn twenty thousand a week or nine hundred dollars a month. Being in it says nothing about your intelligence. Asiya was running a business. Another was an engineer.</w:t>
+        <w:t xml:space="preserve">The escalation isn't your weakness showing up. It's a sequence, it has stages, and it runs roughly the same way whether you earn twenty thousand a week or nine hundred dollars a month. Being in it says nothing about your intelligence. Tolu was running a business. Ifeoma was an engineer.</w:t>
       </w:r>
     </w:p>
     <w:p>
@@ -3194,7 +3162,7 @@
         <w:spacing w:after="160"/>
       </w:pPr>
       <w:r>
-        <w:t xml:space="preserve">Peace described exactly this. </w:t>
+        <w:t xml:space="preserve">Amaka described exactly this. </w:t>
       </w:r>
       <w:r>
         <w:rPr>
@@ -3333,7 +3301,7 @@
         <w:spacing w:after="160"/>
       </w:pPr>
       <w:r>
-        <w:t xml:space="preserve">The engineer gave the cleanest account of it: </w:t>
+        <w:t xml:space="preserve">Ifeoma gave the cleanest account of it: </w:t>
       </w:r>
       <w:r>
         <w:rPr>
@@ -3355,7 +3323,7 @@
         <w:spacing w:after="160"/>
       </w:pPr>
       <w:r>
-        <w:t>The obligation came from somewhere real. Maybe he helped you once. Maybe you earn more and the imbalance embarrasses you both. Maybe you said something early on, before you understood where it was going, and now you feel bound to it. The engineer had a whole pact about it.</w:t>
+        <w:t>The obligation came from somewhere real. Maybe he helped you once. Maybe you earn more and the imbalance embarrasses you both. Maybe you said something early on, before you understood where it was going, and now you feel bound to it. Ifeoma had a whole pact about it.</w:t>
       </w:r>
     </w:p>
     <w:p>
@@ -3372,7 +3340,7 @@
       </w:pPr>
       <w:r>
         <w:lastRenderedPageBreak/>
-        <w:t xml:space="preserve">Charity's version was quieter and harder to hear: </w:t>
+        <w:t xml:space="preserve">Bisi's version was quieter and harder to hear: </w:t>
       </w:r>
       <w:r>
         <w:rPr>
@@ -3765,7 +3733,7 @@
         <w:spacing w:after="160"/>
       </w:pPr>
       <w:r>
-        <w:t>Kikelomo's account is five thousand here, two thousand there. Add up a year of that and it's not small anymore.</w:t>
+        <w:t>Zainab's story is five thousand here, two thousand there. Add up a year of that and it's not small anymore.</w:t>
       </w:r>
     </w:p>
     <w:p>
@@ -3858,7 +3826,7 @@
                 <w:color w:val="78350F"/>
                 <w:sz w:val="21"/>
               </w:rPr>
-              <w:t>A resolution is a feeling and feelings expire. A total is a fact and facts do not. The women in the published interviews could name their totals afterwards. Not while it was still happening.</w:t>
+              <w:t>A resolution is a feeling and feelings expire. A total is a fact and facts do not. Women who have been through this can name their totals afterwards. Almost never while it's still happening.</w:t>
             </w:r>
           </w:p>
         </w:tc>
@@ -4449,7 +4417,7 @@
         <w:spacing w:after="160"/>
       </w:pPr>
       <w:r>
-        <w:t>Celeste, twenty-two, got her ₦30,000 back eventually. In the published accounts she's the exception, not the rule.</w:t>
+        <w:t>Chioma, twenty-two, got her ₦30,000 back eventually. She's the exception, not the rule.</w:t>
       </w:r>
     </w:p>
     <w:p>
@@ -4586,13 +4554,13 @@
         <w:spacing w:after="160"/>
       </w:pPr>
       <w:r>
-        <w:t xml:space="preserve">Some go straight to shame, at themselves. Asiya's </w:t>
+        <w:t xml:space="preserve">Some go straight to shame, at themselves. Tolu's </w:t>
       </w:r>
       <w:r>
         <w:rPr>
           <w:i/>
         </w:rPr>
-        <w:t>"how was I so foolish?"</w:t>
+        <w:t>"how was I that foolish?"</w:t>
       </w:r>
       <w:r>
         <w:t xml:space="preserve"> is that reaction exactly, and it's the most common one. Nothing about the number says you were stupid. It says a sequence ran on you and nobody had described it to you before. That's what Chapters 1 and 2 were for.</w:t>
@@ -5669,7 +5637,7 @@
         <w:spacing w:after="160"/>
       </w:pPr>
       <w:r>
-        <w:t>Of the women who gave their accounts publicly, one got her money back. Celeste, twenty-two, ₦30,000, eventually. Asiya's ₦500,000, gone. The engineer's ₦600,000, gone. The pattern isn't ambiguous and pretending otherwise would waste your time.</w:t>
+        <w:t>Of the women in this book, one got her money back. Chioma, twenty-two, ₦30,000, eventually. Tolu's ₦500,000, gone. Ifeoma's ₦600,000, gone. The pattern isn't ambiguous and pretending otherwise would waste your time.</w:t>
       </w:r>
     </w:p>
     <w:p>
@@ -6172,13 +6140,13 @@
         <w:t>He turns it around.</w:t>
       </w:r>
       <w:r>
-        <w:t xml:space="preserve"> Everything he's spent on you, everything he's done, the fact that you're keeping score. Aaliyah's boyfriend, on the loan she took for him, said: </w:t>
+        <w:t xml:space="preserve"> Everything he's spent on you, everything he's done, the fact that you're keeping score. Nneka's boyfriend, on the loan she took for him, said: </w:t>
       </w:r>
       <w:r>
         <w:rPr>
           <w:i/>
         </w:rPr>
-        <w:t>"He didn't force me to contact loan apps."</w:t>
+        <w:t>"I didn't force you to go to the loan apps."</w:t>
       </w:r>
     </w:p>
     <w:p>
@@ -6200,7 +6168,7 @@
         <w:t>He disappears.</w:t>
       </w:r>
       <w:r>
-        <w:t xml:space="preserve"> Celeste's description of what she suspected was a pattern: </w:t>
+        <w:t xml:space="preserve"> Chioma's description of what she suspected was a pattern: </w:t>
       </w:r>
       <w:r>
         <w:rPr>
@@ -6356,7 +6324,7 @@
         <w:spacing w:after="160"/>
       </w:pPr>
       <w:r>
-        <w:t>Aaliyah was twenty. A student. Her boyfriend needed money she didn't have, so she went to the loan apps and borrowed ₦121,000.</w:t>
+        <w:t>Nneka was twenty. A student. Her boyfriend needed money she didn't have, so she went to the loan apps and borrowed ₦121,000.</w:t>
       </w:r>
     </w:p>
     <w:p>
@@ -6378,7 +6346,7 @@
         <w:rPr>
           <w:i/>
         </w:rPr>
-        <w:t>"He said he didn't force me to contact loan apps."</w:t>
+        <w:t>"I didn't force you to go to the loan apps."</w:t>
       </w:r>
     </w:p>
     <w:p>
@@ -7401,7 +7369,7 @@
         <w:spacing w:after="160"/>
       </w:pPr>
       <w:r>
-        <w:t xml:space="preserve">Noor was twenty-two. Reflecting on what her money had gone toward, she said: </w:t>
+        <w:t xml:space="preserve">Halima was twenty-two. Reflecting on what her money had gone toward, she said: </w:t>
       </w:r>
       <w:r>
         <w:rPr>
@@ -8434,7 +8402,7 @@
         <w:spacing w:after="160"/>
       </w:pPr>
       <w:r>
-        <w:t xml:space="preserve">Charity, thirty-three, on ₦85,000 a month, described a partner who took her card and spent her ₦85,000 salary. Alongside it she said: </w:t>
+        <w:t xml:space="preserve">Bisi, thirty-three, on ₦85,000 a month, described a partner who took her card and spent her ₦85,000 salary. Alongside it she said: </w:t>
       </w:r>
       <w:r>
         <w:rPr>
@@ -8965,7 +8933,7 @@
           <w:color w:val="6B7280"/>
           <w:sz w:val="21"/>
         </w:rPr>
-        <w:t xml:space="preserve">If anything in this book described your situation more closely than you were comfortable with, that is not a coincidence and you are not the only one. The women quoted in these pages were interviewed by Nigerian publications and spoke on the record, which is a harder thing to do than reading this was. Their words are the reason this book exists.</w:t>
+        <w:t xml:space="preserve">If anything in this book described your situation more closely than you were comfortable with, that is not a coincidence and you are not the only one. The women in these pages are composites, but every part of their stories is something real women live through. That is the reason this book exists.</w:t>
       </w:r>
     </w:p>
     <w:p>
@@ -8977,199 +8945,6 @@
           <w:b/>
         </w:rPr>
         <w:t>The Connection Code</w:t>
-      </w:r>
-    </w:p>
-    <w:p>
-      <w:pPr>
-        <w:pStyle w:val="Heading1"/>
-        <w:pageBreakBefore/>
-        <w:spacing w:after="280"/>
-      </w:pPr>
-      <w:bookmarkStart w:id="990" w:name="_TocSources"/>
-      <w:r>
-        <w:rPr>
-          <w:rFonts w:ascii="Arial" w:eastAsia="Arial" w:hAnsi="Arial"/>
-          <w:color w:val="1B2A4A"/>
-          <w:sz w:val="36"/>
-        </w:rPr>
-        <w:t>Sources</w:t>
-      </w:r>
-      <w:bookmarkEnd w:id="990"/>
-    </w:p>
-    <w:p>
-      <w:pPr>
-        <w:spacing w:after="160"/>
-      </w:pPr>
-      <w:r>
-        <w:t xml:space="preserve">The women quoted in this book told their stories to Nigerian publications. Their words and details come from the articles below.</w:t>
-      </w:r>
-    </w:p>
-    <w:p>
-      <w:pPr>
-        <w:spacing w:after="120"/>
-      </w:pPr>
-      <w:r>
-        <w:rPr>
-          <w:b/>
-          <w:color w:val="1B2A4A"/>
-        </w:rPr>
-        <w:t xml:space="preserve">The women's stories</w:t>
-      </w:r>
-    </w:p>
-    <w:p>
-      <w:pPr>
-        <w:spacing w:after="160"/>
-      </w:pPr>
-      <w:r>
-        <w:rPr>
-          <w:b/>
-        </w:rPr>
-        <w:t xml:space="preserve">Aaliyah (loan apps, Chapters 5 and 6) and Asiya: </w:t>
-      </w:r>
-      <w:r>
-        <w:t xml:space="preserve">Zikoko, “5 Nigerian Women on Lending Their Boyfriend Money,” January 2026. zikoko.com/her/5-nigerian-women-on-lending-their-boyfriend-money</w:t>
-      </w:r>
-    </w:p>
-    <w:p>
-      <w:pPr>
-        <w:spacing w:after="160"/>
-      </w:pPr>
-      <w:r>
-        <w:rPr>
-          <w:b/>
-        </w:rPr>
-        <w:t xml:space="preserve">The machine learning engineer (Introduction, Chapters 1, 2 and 5): </w:t>
-      </w:r>
-      <w:r>
-        <w:rPr>
-          <w:highlight w:val="yellow"/>
-        </w:rPr>
-        <w:t xml:space="preserve">[ADD SOURCE: publication, article title, date, link]</w:t>
-      </w:r>
-    </w:p>
-    <w:p>
-      <w:pPr>
-        <w:spacing w:after="160"/>
-      </w:pPr>
-      <w:r>
-        <w:rPr>
-          <w:b/>
-        </w:rPr>
-        <w:t xml:space="preserve">Peace: </w:t>
-      </w:r>
-      <w:r>
-        <w:rPr>
-          <w:highlight w:val="yellow"/>
-        </w:rPr>
-        <w:t xml:space="preserve">[ADD SOURCE: publication, article title, date, link]</w:t>
-      </w:r>
-    </w:p>
-    <w:p>
-      <w:pPr>
-        <w:spacing w:after="160"/>
-      </w:pPr>
-      <w:r>
-        <w:rPr>
-          <w:b/>
-        </w:rPr>
-        <w:t xml:space="preserve">Charity: </w:t>
-      </w:r>
-      <w:r>
-        <w:rPr>
-          <w:highlight w:val="yellow"/>
-        </w:rPr>
-        <w:t xml:space="preserve">[ADD SOURCE: publication, article title, date, link]</w:t>
-      </w:r>
-    </w:p>
-    <w:p>
-      <w:pPr>
-        <w:spacing w:after="160"/>
-      </w:pPr>
-      <w:r>
-        <w:rPr>
-          <w:b/>
-        </w:rPr>
-        <w:t xml:space="preserve">Kikelomo: </w:t>
-      </w:r>
-      <w:r>
-        <w:rPr>
-          <w:highlight w:val="yellow"/>
-        </w:rPr>
-        <w:t xml:space="preserve">[ADD SOURCE: publication, article title, date, link]</w:t>
-      </w:r>
-    </w:p>
-    <w:p>
-      <w:pPr>
-        <w:spacing w:after="160"/>
-      </w:pPr>
-      <w:r>
-        <w:rPr>
-          <w:b/>
-        </w:rPr>
-        <w:t xml:space="preserve">Celeste: </w:t>
-      </w:r>
-      <w:r>
-        <w:rPr>
-          <w:highlight w:val="yellow"/>
-        </w:rPr>
-        <w:t xml:space="preserve">[ADD SOURCE: publication, article title, date, link]</w:t>
-      </w:r>
-    </w:p>
-    <w:p>
-      <w:pPr>
-        <w:spacing w:after="160"/>
-      </w:pPr>
-      <w:r>
-        <w:rPr>
-          <w:b/>
-        </w:rPr>
-        <w:t xml:space="preserve">Noor: </w:t>
-      </w:r>
-      <w:r>
-        <w:rPr>
-          <w:highlight w:val="yellow"/>
-        </w:rPr>
-        <w:t xml:space="preserve">[ADD SOURCE: publication, article title, date, link]</w:t>
-      </w:r>
-    </w:p>
-    <w:p>
-      <w:pPr>
-        <w:spacing w:after="120"/>
-      </w:pPr>
-      <w:r>
-        <w:rPr>
-          <w:b/>
-          <w:color w:val="1B2A4A"/>
-        </w:rPr>
-        <w:t xml:space="preserve">Loan app rules</w:t>
-      </w:r>
-    </w:p>
-    <w:p>
-      <w:pPr>
-        <w:spacing w:after="160"/>
-      </w:pPr>
-      <w:r>
-        <w:t xml:space="preserve">Federal Competition and Consumer Protection Commission (FCCPC), Digital, Electronic, Online or Non-Traditional Consumer Lending Regulations, 2025. Current rules, approved lenders and complaint channels: fccpc.gov.ng</w:t>
-      </w:r>
-    </w:p>
-    <w:p>
-      <w:pPr>
-        <w:spacing w:after="120"/>
-      </w:pPr>
-      <w:r>
-        <w:rPr>
-          <w:b/>
-          <w:color w:val="1B2A4A"/>
-        </w:rPr>
-        <w:t xml:space="preserve">Support services</w:t>
-      </w:r>
-    </w:p>
-    <w:p>
-      <w:pPr>
-        <w:spacing w:after="160"/>
-      </w:pPr>
-      <w:r>
-        <w:t xml:space="preserve">The services in Chapter 8 were checked when this book was written. Phone numbers and addresses change, so confirm on each organisation’s official website or at findahelpline.com.</w:t>
       </w:r>
     </w:p>
     <w:sectPr>

</xml_diff>